<commit_message>
feat: add 12-month study curriculum and consultant notes
- Add 12-month reading plan, compiled book notes, an independent
  consultant's library, and a 3-month deep-dive study guide (plus PDF)
  to outputs/learning/
- Fix milestone order in CLAUDE.md, business-info.md, and
  current-data.md to match the canonical order in curriculum.md
- Refresh key-metrics.md with latest daily FX data
</commit_message>
<xml_diff>
--- a/outputs/decks/2026-07-10-team-deck-speech.docx
+++ b/outputs/decks/2026-07-10-team-deck-speech.docx
@@ -14,7 +14,15 @@
     </w:p>
     <w:p>
       <w:r>
-        <w:t>July 10, 2026 | For Mark, Cam and Hannah (Mike on the call)</w:t>
+        <w:t xml:space="preserve">July 10, </w:t>
+      </w:r>
+      <w:proofErr w:type="gramStart"/>
+      <w:r>
+        <w:t>2026</w:t>
+      </w:r>
+      <w:proofErr w:type="gramEnd"/>
+      <w:r>
+        <w:t xml:space="preserve"> | For Mark, Cam and Hannah (Mike on the call)</w:t>
       </w:r>
     </w:p>
     <w:p/>
@@ -32,13 +40,29 @@
     <w:p/>
     <w:p>
       <w:r>
-        <w:t>We both agreed this has huge potential. And I'll be honest, it's proven more complex than I thought, and that's actually got me excited. Because when things are hard, the upside is exponential.</w:t>
-      </w:r>
-    </w:p>
-    <w:p/>
-    <w:p>
-      <w:r>
-        <w:t>Here's what's on my mind. The next five years, technology is going to change the game. We have to get in front of that curve. AI is driving the cost of information toward zero. The thing consulting used to sell, the decks, the frameworks, the market scans, "here's what your data says," that's being taken over by AI. Pressure-testing a strategy, stress-testing a P&amp;L, generating options, that used to be a fifty-thousand-dollar engagement. Now a competent operator with the right tools does it in an afternoon.</w:t>
+        <w:t xml:space="preserve">We both agreed this has huge potential. And I'll be honest, it's proven more complex than I thought, and that's </w:t>
+      </w:r>
+      <w:proofErr w:type="gramStart"/>
+      <w:r>
+        <w:t>actually got</w:t>
+      </w:r>
+      <w:proofErr w:type="gramEnd"/>
+      <w:r>
+        <w:t xml:space="preserve"> me excited. Because when things are hard, the upside is exponential.</w:t>
+      </w:r>
+    </w:p>
+    <w:p/>
+    <w:p>
+      <w:r>
+        <w:t xml:space="preserve">Here's what's on my mind. The next five years, technology is going to change the game. We </w:t>
+      </w:r>
+      <w:proofErr w:type="gramStart"/>
+      <w:r>
+        <w:t>have to</w:t>
+      </w:r>
+      <w:proofErr w:type="gramEnd"/>
+      <w:r>
+        <w:t xml:space="preserve"> get in front of that curve. AI is driving the cost of information toward zero. The thing consulting used to sell, the decks, the frameworks, the market scans, "here's what your data says," that's being taken over by AI. Pressure-testing a strategy, stress-testing a P&amp;L, generating options, that used to be a fifty-thousand-dollar engagement. Now a competent operator with the right tools does it in an afternoon.</w:t>
       </w:r>
     </w:p>
     <w:p/>
@@ -49,8 +73,13 @@
     </w:p>
     <w:p/>
     <w:p>
-      <w:r>
-        <w:t>So let's get into where I see this going, and I want your honest thoughts on it.</w:t>
+      <w:proofErr w:type="gramStart"/>
+      <w:r>
+        <w:t>So</w:t>
+      </w:r>
+      <w:proofErr w:type="gramEnd"/>
+      <w:r>
+        <w:t xml:space="preserve"> let's get into where I see this going, and I want your honest thoughts on it.</w:t>
       </w:r>
     </w:p>
     <w:p/>
@@ -80,13 +109,39 @@
     <w:p/>
     <w:p>
       <w:r>
-        <w:t>Business Without You. We get the owner out of the way of their own business. Our audience is owner-operators doing one to ten million a year who are the bottleneck everything runs through.</w:t>
-      </w:r>
-    </w:p>
-    <w:p/>
-    <w:p>
-      <w:r>
-        <w:t>The promise is fifteen hours back in their week, plus up to fifty thousand in profit found already sitting inside the business. The exact headline is still being sharpened, that's honest, but that's the shape of it.</w:t>
+        <w:t xml:space="preserve">Business Without You. We get the owner out of the way of their own business. Our audience is owner-operators </w:t>
+      </w:r>
+      <w:r>
+        <w:t xml:space="preserve">in the </w:t>
+      </w:r>
+      <w:proofErr w:type="gramStart"/>
+      <w:r>
+        <w:t>blue collar</w:t>
+      </w:r>
+      <w:proofErr w:type="gramEnd"/>
+      <w:r>
+        <w:t xml:space="preserve"> space </w:t>
+      </w:r>
+      <w:r>
+        <w:t xml:space="preserve">doing one to </w:t>
+      </w:r>
+      <w:r>
+        <w:t>FIVE</w:t>
+      </w:r>
+      <w:r>
+        <w:t xml:space="preserve"> million a year who are the bottleneck everything runs through.</w:t>
+      </w:r>
+    </w:p>
+    <w:p/>
+    <w:p>
+      <w:r>
+        <w:t>The promise is</w:t>
+      </w:r>
+      <w:r>
+        <w:t xml:space="preserve"> undecided so far</w:t>
+      </w:r>
+      <w:r>
+        <w:t>.</w:t>
       </w:r>
     </w:p>
     <w:p/>
@@ -110,7 +165,15 @@
     <w:p/>
     <w:p>
       <w:r>
-        <w:t>The curriculum is built and it's being tested against real feedback. Every milestone follows the same flow: learn it, see it, do it, extend it. So the owner gets a practice rep before they ever touch their own numbers. Every video's kept to eight to fifteen minutes, because these owners don't have time.</w:t>
+        <w:t xml:space="preserve">The curriculum is built and it's being tested against real feedback. Every milestone follows the same flow: learn it, see it, do it, extend it. </w:t>
+      </w:r>
+      <w:proofErr w:type="gramStart"/>
+      <w:r>
+        <w:t>So</w:t>
+      </w:r>
+      <w:proofErr w:type="gramEnd"/>
+      <w:r>
+        <w:t xml:space="preserve"> the owner gets a practice rep before they ever touch their own numbers. Every video's kept to eight to fifteen minutes, because these owners don't have time.</w:t>
       </w:r>
     </w:p>
     <w:p/>
@@ -128,7 +191,15 @@
     <w:p/>
     <w:p>
       <w:r>
-        <w:t>Here's the part I'm proud of. Every single milestone has a real working tool behind it. Actual software, not slideware. All seven are built and backtested against real client P&amp;Ls, checked until the numbers matched to the cent.</w:t>
+        <w:t xml:space="preserve">Here's the part I'm proud of. Every single milestone has a real working tool behind it. Actual software, not slideware. All seven are built and </w:t>
+      </w:r>
+      <w:proofErr w:type="spellStart"/>
+      <w:r>
+        <w:t>backtested</w:t>
+      </w:r>
+      <w:proofErr w:type="spellEnd"/>
+      <w:r>
+        <w:t xml:space="preserve"> against real client P&amp;Ls, checked until the numbers matched to the cent.</w:t>
       </w:r>
     </w:p>
     <w:p/>
@@ -140,7 +211,15 @@
     <w:p/>
     <w:p>
       <w:r>
-        <w:t>The next few slides show you three of them actually running.</w:t>
+        <w:t xml:space="preserve">The next few slides show you three of them </w:t>
+      </w:r>
+      <w:proofErr w:type="gramStart"/>
+      <w:r>
+        <w:t>actually running</w:t>
+      </w:r>
+      <w:proofErr w:type="gramEnd"/>
+      <w:r>
+        <w:t>.</w:t>
       </w:r>
     </w:p>
     <w:p/>
@@ -152,13 +231,29 @@
     <w:p/>
     <w:p>
       <w:r>
-        <w:t>This one's free and live right now, anyone can use it. An owner uploads their P&amp;L and gets this back. Here's a real anonymized run, a restoration company. Revenue about 1.4 million, looks healthy on the surface. But the operating margin is minus five percent. Costs are running at a hundred and five percent of revenue. This business is losing money and the owner probably doesn't feel it yet.</w:t>
-      </w:r>
-    </w:p>
-    <w:p/>
-    <w:p>
-      <w:r>
-        <w:t>That's exactly the point. The tool doesn't diagnose, it surfaces the signal and opens the conversation. That's our free front door. Someone sees a number like that, and they want to talk to us.</w:t>
+        <w:t xml:space="preserve">This one's free and live right now, anyone can use it. An owner uploads their P&amp;L and gets this back. Here's a real anonymized run, a restoration company. Revenue about 1.4 million, looks healthy on the surface. But the operating margin is minus five percent. Costs are running at a hundred and five percent of revenue. This business is losing </w:t>
+      </w:r>
+      <w:proofErr w:type="gramStart"/>
+      <w:r>
+        <w:t>money</w:t>
+      </w:r>
+      <w:proofErr w:type="gramEnd"/>
+      <w:r>
+        <w:t xml:space="preserve"> and the owner probably doesn't feel it yet.</w:t>
+      </w:r>
+    </w:p>
+    <w:p/>
+    <w:p>
+      <w:r>
+        <w:t xml:space="preserve">That's exactly the point. The tool doesn't </w:t>
+      </w:r>
+      <w:proofErr w:type="gramStart"/>
+      <w:r>
+        <w:t>diagnose,</w:t>
+      </w:r>
+      <w:proofErr w:type="gramEnd"/>
+      <w:r>
+        <w:t xml:space="preserve"> it surfaces the signal and opens the conversation. That's our free front door. Someone sees a number like that, and they want to talk to us.</w:t>
       </w:r>
     </w:p>
     <w:p/>
@@ -170,7 +265,15 @@
     <w:p/>
     <w:p>
       <w:r>
-        <w:t>This is milestone three. The owner picks the five numbers that actually matter for their business and checks them in fifteen minutes every Monday. Red, yellow, green. Here's a trades business. Cash on hand is red, that's the fire. But look at the two yellows, backlog and lead flow, those are the early warning before it becomes a red.</w:t>
+        <w:t xml:space="preserve">This is milestone three. The owner picks the five numbers that </w:t>
+      </w:r>
+      <w:proofErr w:type="gramStart"/>
+      <w:r>
+        <w:t>actually matter</w:t>
+      </w:r>
+      <w:proofErr w:type="gramEnd"/>
+      <w:r>
+        <w:t xml:space="preserve"> for their business and checks them in fifteen minutes every Monday. Red, yellow, green. Here's a trades business. Cash on hand is red, that's the fire. But look at the two yellows, backlog and lead flow, those are the early warning before it becomes a red.</w:t>
       </w:r>
     </w:p>
     <w:p/>
@@ -188,7 +291,15 @@
     <w:p/>
     <w:p>
       <w:r>
-        <w:t>Milestone six, the one that helps the owner sleep. A thirteen-week rolling cash forecast, plus a receivables check. Here, eighteen thousand four hundred dollars overdue against the client's own payment terms, twenty-two days late across four accounts. That's real money the owner already earned, just sitting out there uncollected.</w:t>
+        <w:t xml:space="preserve">Milestone six, the one that helps the owner sleep. A thirteen-week rolling cash forecast, plus </w:t>
+      </w:r>
+      <w:proofErr w:type="gramStart"/>
+      <w:r>
+        <w:t>a receivables</w:t>
+      </w:r>
+      <w:proofErr w:type="gramEnd"/>
+      <w:r>
+        <w:t xml:space="preserve"> check. Here, eighteen thousand four hundred dollars overdue against the client's own payment terms, twenty-two days late across four accounts. That's real money the owner already earned, just sitting out there uncollected.</w:t>
       </w:r>
     </w:p>
     <w:p/>
@@ -205,8 +316,29 @@
     </w:p>
     <w:p/>
     <w:p>
-      <w:r>
-        <w:t>So the tools are built. Now, how do people find us. The front door is already open. We went social first, not website first. The Instagram page is live, first content's posted, built around the real pain these owners feel every day. The link-in-bio hub is live and it's ours, self-hosted, no third-party logo on it. And the funnel's drafted around a proven pattern. Free diagnostic, then email, then a fit application before anyone gets on a sales call. So we're not chasing people. They come to us, and they've already raised their hand.</w:t>
+      <w:proofErr w:type="gramStart"/>
+      <w:r>
+        <w:t>So</w:t>
+      </w:r>
+      <w:proofErr w:type="gramEnd"/>
+      <w:r>
+        <w:t xml:space="preserve"> the tools are built. Now, how do people find us. The front door is already open. We went social first, not website first. The Instagram page is live, first </w:t>
+      </w:r>
+      <w:proofErr w:type="gramStart"/>
+      <w:r>
+        <w:t>content's</w:t>
+      </w:r>
+      <w:proofErr w:type="gramEnd"/>
+      <w:r>
+        <w:t xml:space="preserve"> posted, built around the real pain these owners feel every day. The link-in-bio hub is live and it's ours, self-hosted, no third-party logo on it. And the funnel's drafted around a proven pattern. Free diagnostic, then email, then a fit application before anyone gets on a sales call. </w:t>
+      </w:r>
+      <w:proofErr w:type="gramStart"/>
+      <w:r>
+        <w:t>So</w:t>
+      </w:r>
+      <w:proofErr w:type="gramEnd"/>
+      <w:r>
+        <w:t xml:space="preserve"> we're not chasing people. They come to us, and they've already raised their hand.</w:t>
       </w:r>
     </w:p>
     <w:p/>
@@ -218,7 +350,15 @@
     <w:p/>
     <w:p>
       <w:r>
-        <w:t>And I didn't just make this funnel up. I studied the best in the coaching space, Hormozi, Cardone, the whole lot, and I kept only what fits us. Here's the flow on the left. Two posts a day, value only. The free analyzer captures an email before it shows the result. Then Mark on camera at the moment of peak interest. Then a fit application, we qualify, we don't sell. Then a booked call, but only with warm, self-qualified owners. On the right is what makes us different. Finance-led is our white space. No trade coach out there offers a try-before-you-buy P&amp;L diagnostic. That's our wedge. We shoot plainer than the gurus, real shop, operator not guru, we skip the money-flex because it kills trust with practical owners. And every claim stays honest. No invented numbers, ever. The fifty-thousand figure gets checked against a real client result before it goes in any ad.</w:t>
+        <w:t xml:space="preserve">And I didn't just make this funnel up. I studied the best in the coaching space, Hormozi, Cardone, the whole lot, and I kept only what fits us. Here's the flow on the left. Two posts a day, value only. The free analyzer captures an email before it shows the result. Then Mark on camera </w:t>
+      </w:r>
+      <w:proofErr w:type="gramStart"/>
+      <w:r>
+        <w:t>at the moment</w:t>
+      </w:r>
+      <w:proofErr w:type="gramEnd"/>
+      <w:r>
+        <w:t xml:space="preserve"> of peak interest. Then a fit application, we qualify, we don't sell. Then a booked call, but only with warm, self-qualified owners. On the right is what makes us different. Finance-led is our white space. No trade coach out there offers a try-before-you-buy P&amp;L diagnostic. That's our wedge. We shoot plainer than the gurus, real shop, operator not guru, we skip the money-flex because it kills trust with practical owners. And every claim stays honest. No invented numbers, ever. The fifty-thousand figure gets checked against a real client result before it goes in any ad.</w:t>
       </w:r>
     </w:p>
     <w:p/>
@@ -236,13 +376,26 @@
     <w:p/>
     <w:p>
       <w:r>
-        <w:t>A one-time five-thousand-dollar payment caps our long-term growth, it's a treadmill. A recurring community turns one sale into a lifetime relationship, and that's what actually gets us to real financial freedom on this thing.</w:t>
-      </w:r>
-    </w:p>
-    <w:p/>
-    <w:p>
-      <w:r>
-        <w:t>So the twelve-week program becomes the front door. It delivers a fast win and turns a buyer into a long-term member. The community and the live calls, weekly Q&amp;A with Mark, CFO office hours with Cam, quarterly reviews, that's the real business. The premium partner work lives on the outside, higher margin.</w:t>
+        <w:t xml:space="preserve">A one-time five-thousand-dollar payment caps our long-term growth, it's a treadmill. A recurring community turns one sale into a lifetime relationship, and that's what </w:t>
+      </w:r>
+      <w:proofErr w:type="gramStart"/>
+      <w:r>
+        <w:t>actually gets</w:t>
+      </w:r>
+      <w:proofErr w:type="gramEnd"/>
+      <w:r>
+        <w:t xml:space="preserve"> us to real financial freedom on this thing.</w:t>
+      </w:r>
+    </w:p>
+    <w:p/>
+    <w:p>
+      <w:proofErr w:type="gramStart"/>
+      <w:r>
+        <w:t>So</w:t>
+      </w:r>
+      <w:proofErr w:type="gramEnd"/>
+      <w:r>
+        <w:t xml:space="preserve"> the twelve-week program becomes the front door. It delivers a fast win and turns a buyer into a long-term member. The community and the live calls, weekly Q&amp;A with Mark, CFO office hours with Cam, quarterly reviews, that's the real business. The premium partner work lives on the outside, higher margin.</w:t>
       </w:r>
     </w:p>
     <w:p/>
@@ -254,7 +407,23 @@
     <w:p/>
     <w:p>
       <w:r>
-        <w:t>This is a picture of everything we could offer, and there's one insight I really want you to catch. Almost every one-time event has a recurring twin. Look at the columns. On the left, event-based, the entry doors, a Profit Discovery session, a Hiring Sprint, a strategy day. On the right, cyclical, and that's where the value actually lives. The Profit Discovery session becomes monthly CFO office hours with Cam. The Hiring Sprint becomes recruiting on retainer. And it's split again, top row our in-house team, bottom row the partner network we build over time. So the events get them in the door, and the recurring side is where they land and stay. That's the business in one picture.</w:t>
+        <w:t xml:space="preserve">This is a picture of everything we could offer, and there's one insight I really want you to catch. Almost every one-time event has a recurring twin. Look at the columns. On the left, event-based, the entry doors, a Profit Discovery session, a Hiring Sprint, a strategy day. On the right, cyclical, and that's where the value </w:t>
+      </w:r>
+      <w:proofErr w:type="gramStart"/>
+      <w:r>
+        <w:t>actually lives</w:t>
+      </w:r>
+      <w:proofErr w:type="gramEnd"/>
+      <w:r>
+        <w:t xml:space="preserve">. The Profit Discovery session becomes monthly CFO office hours with Cam. The Hiring Sprint becomes recruiting on retainer. And it's split again, top row our in-house team, bottom row the partner network we build over time. </w:t>
+      </w:r>
+      <w:proofErr w:type="gramStart"/>
+      <w:r>
+        <w:t>So</w:t>
+      </w:r>
+      <w:proofErr w:type="gramEnd"/>
+      <w:r>
+        <w:t xml:space="preserve"> the events get them in the door, and the recurring side is where they land and stay. That's the business in one picture.</w:t>
       </w:r>
     </w:p>
     <w:p/>
@@ -302,7 +471,15 @@
     <w:p/>
     <w:p>
       <w:r>
-        <w:t>And I want to be clear, this only works with the three of you built in, not bolted on. Mark, you're the face and the teaching, same as always, Zoom-first so you can iterate before we polish anything. Cam, the CFO milestones lead with your judgment, and honestly your input is what keeps the fifty-thousand promise honest. Hannah, milestone seven, building the team, needs your hiring expertise or it's just generic advice. And I run it day to day. Community, leads, sales, marketing, this whole build, reporting back to all three of you.</w:t>
+        <w:t xml:space="preserve">And I want to be clear, this only works with the three of you built in, not bolted on. Mark, you're the face and the teaching, same as always, Zoom-first so you can iterate before we polish anything. Cam, the CFO milestones lead with your judgment, and honestly your input is what keeps the </w:t>
+      </w:r>
+      <w:proofErr w:type="gramStart"/>
+      <w:r>
+        <w:t>fifty-thousand</w:t>
+      </w:r>
+      <w:proofErr w:type="gramEnd"/>
+      <w:r>
+        <w:t xml:space="preserve"> promise honest. Hannah, milestone seven, building the team, needs your hiring expertise or it's just generic advice. And I run it day to day. Community, leads, sales, marketing, this whole build, reporting back to all three of you.</w:t>
       </w:r>
     </w:p>
     <w:p/>
@@ -313,14 +490,27 @@
     </w:p>
     <w:p/>
     <w:p>
-      <w:r>
-        <w:t>So where's this headed. These are targets, not promises. Foundation's built, that's today. End of July, the system's waxed. Late August, the model's locked with Mike. Year end, the product's live and we've got our first cohort.</w:t>
-      </w:r>
-    </w:p>
-    <w:p/>
-    <w:p>
-      <w:r>
-        <w:t>I've put a lot into this over the last month. I did it because I believe in what we've got, and because I don't think there's a reason we can't build this a lot bigger than three million, if we move fast enough. I want us to win this together. That's why I'm standing here.</w:t>
+      <w:proofErr w:type="gramStart"/>
+      <w:r>
+        <w:t>So</w:t>
+      </w:r>
+      <w:proofErr w:type="gramEnd"/>
+      <w:r>
+        <w:t xml:space="preserve"> where's this headed. These are targets, not promises. Foundation's built, that's today. End of July, the system's waxed. Late August, the model's locked with Mike. Year end, the product's live and we've got our first cohort.</w:t>
+      </w:r>
+    </w:p>
+    <w:p/>
+    <w:p>
+      <w:r>
+        <w:t xml:space="preserve">I've put a lot into this over the last month. I did it because I believe in what we've got, and because I don't think there's a </w:t>
+      </w:r>
+      <w:proofErr w:type="gramStart"/>
+      <w:r>
+        <w:t>reason</w:t>
+      </w:r>
+      <w:proofErr w:type="gramEnd"/>
+      <w:r>
+        <w:t xml:space="preserve"> we can't build this a lot bigger than three million, if we move fast enough. I want us to win this together. That's why I'm standing here.</w:t>
       </w:r>
     </w:p>
     <w:p/>
@@ -331,8 +521,13 @@
     </w:p>
     <w:p/>
     <w:p>
-      <w:r>
-        <w:t>So here's my ask. I'm not asking you to sign off on every detail today. I'm asking for your eyes, your input, and your yes on the direction. Just tell me if this is the right shape, and where your expertise should sharpen it before we lock anything in.</w:t>
+      <w:proofErr w:type="gramStart"/>
+      <w:r>
+        <w:t>So</w:t>
+      </w:r>
+      <w:proofErr w:type="gramEnd"/>
+      <w:r>
+        <w:t xml:space="preserve"> here's my ask. I'm not asking you to sign off on every detail today. I'm asking for your eyes, your input, and your yes on the direction. Just tell me if this is the right shape, and where your expertise should sharpen it before we lock anything in.</w:t>
       </w:r>
     </w:p>
     <w:p/>

</xml_diff>